<commit_message>
added overview over new topic
</commit_message>
<xml_diff>
--- a/in-progress/heat-pump-control/influences.docx
+++ b/in-progress/heat-pump-control/influences.docx
@@ -11,29 +11,22 @@
       </w:r>
     </w:p>
     <w:p>
-      <w:r>
-        <w:t>NB … Normalbetrieb</w:t>
-      </w:r>
-      <w:r>
-        <w:br/>
-        <w:t>EB … Erhöhter Betrieb</w:t>
-      </w:r>
-      <w:r>
-        <w:br/>
-        <w:t>MB … Maximalbetrieb</w:t>
-      </w:r>
-    </w:p>
-    <w:p>
       <w:pPr>
         <w:pStyle w:val="Heading2"/>
       </w:pPr>
       <w:r>
+        <w:t xml:space="preserve">Aufnahmeleistung und </w:t>
+      </w:r>
+      <w:r>
         <w:t>Heizleistung der Wärmepumpe</w:t>
       </w:r>
     </w:p>
     <w:p>
       <w:r>
-        <w:t>Datenquelle: ??</w:t>
+        <w:t xml:space="preserve">Datenquelle: </w:t>
+      </w:r>
+      <w:r>
+        <w:t>manuelle Eingabe</w:t>
       </w:r>
     </w:p>
     <w:p>
@@ -46,7 +39,26 @@
     </w:p>
     <w:p>
       <w:r>
-        <w:t>Datenquelle: Smart Meter</w:t>
+        <w:t xml:space="preserve">Datenquelle: </w:t>
+      </w:r>
+      <w:r>
+        <w:t>Vorprojekt (Smart Meter)</w:t>
+      </w:r>
+    </w:p>
+    <w:p>
+      <w:r>
+        <w:t>Wartezeit bis zur Änderung (Wolken und andere Faktoren)</w:t>
+      </w:r>
+    </w:p>
+    <w:p>
+      <w:pPr>
+        <w:pStyle w:val="Heading3"/>
+      </w:pPr>
+      <w:r>
+        <w:t>Verstärkten</w:t>
+      </w:r>
+      <w:r>
+        <w:t xml:space="preserve"> Betrieb (3)</w:t>
       </w:r>
     </w:p>
     <w:p>
@@ -54,11 +66,178 @@
         <w:pStyle w:val="ListParagraph"/>
         <w:numPr>
           <w:ilvl w:val="0"/>
-          <w:numId w:val="2"/>
-        </w:numPr>
-      </w:pPr>
-      <w:r>
-        <w:t>EB</w:t>
+          <w:numId w:val="3"/>
+        </w:numPr>
+      </w:pPr>
+      <w:r>
+        <w:t>Aktivierungsgrenzwert definieren</w:t>
+      </w:r>
+    </w:p>
+    <w:p>
+      <w:pPr>
+        <w:pStyle w:val="ListParagraph"/>
+        <w:numPr>
+          <w:ilvl w:val="1"/>
+          <w:numId w:val="3"/>
+        </w:numPr>
+      </w:pPr>
+      <w:r>
+        <w:t xml:space="preserve">Default: </w:t>
+      </w:r>
+      <w:r>
+        <w:t>Aufnahmeleistung</w:t>
+      </w:r>
+      <w:r>
+        <w:t xml:space="preserve"> </w:t>
+      </w:r>
+    </w:p>
+    <w:p>
+      <w:pPr>
+        <w:pStyle w:val="ListParagraph"/>
+        <w:numPr>
+          <w:ilvl w:val="1"/>
+          <w:numId w:val="3"/>
+        </w:numPr>
+      </w:pPr>
+      <w:r>
+        <w:t>manuelle Änderung</w:t>
+      </w:r>
+    </w:p>
+    <w:p>
+      <w:pPr>
+        <w:pStyle w:val="ListParagraph"/>
+        <w:numPr>
+          <w:ilvl w:val="0"/>
+          <w:numId w:val="3"/>
+        </w:numPr>
+      </w:pPr>
+      <w:r>
+        <w:t>Deaktivierungsgrenzwert definieren</w:t>
+      </w:r>
+    </w:p>
+    <w:p>
+      <w:pPr>
+        <w:pStyle w:val="ListParagraph"/>
+        <w:numPr>
+          <w:ilvl w:val="1"/>
+          <w:numId w:val="3"/>
+        </w:numPr>
+      </w:pPr>
+      <w:r>
+        <w:t>Default ??</w:t>
+      </w:r>
+    </w:p>
+    <w:p>
+      <w:pPr>
+        <w:pStyle w:val="ListParagraph"/>
+        <w:numPr>
+          <w:ilvl w:val="1"/>
+          <w:numId w:val="3"/>
+        </w:numPr>
+      </w:pPr>
+      <w:r>
+        <w:t>manuelle Änderung</w:t>
+      </w:r>
+    </w:p>
+    <w:p>
+      <w:pPr>
+        <w:pStyle w:val="ListParagraph"/>
+        <w:numPr>
+          <w:ilvl w:val="1"/>
+          <w:numId w:val="3"/>
+        </w:numPr>
+      </w:pPr>
+      <w:r>
+        <w:t>frühestens nach 10 Minuten</w:t>
+      </w:r>
+    </w:p>
+    <w:p>
+      <w:pPr>
+        <w:pStyle w:val="Heading3"/>
+      </w:pPr>
+      <w:r>
+        <w:t>Maximalbetrieb (4)</w:t>
+      </w:r>
+    </w:p>
+    <w:p>
+      <w:pPr>
+        <w:pStyle w:val="ListParagraph"/>
+        <w:numPr>
+          <w:ilvl w:val="0"/>
+          <w:numId w:val="3"/>
+        </w:numPr>
+      </w:pPr>
+      <w:r>
+        <w:t>Aktivierungsgrenzwert definieren</w:t>
+      </w:r>
+    </w:p>
+    <w:p>
+      <w:pPr>
+        <w:pStyle w:val="ListParagraph"/>
+        <w:numPr>
+          <w:ilvl w:val="1"/>
+          <w:numId w:val="3"/>
+        </w:numPr>
+      </w:pPr>
+      <w:r>
+        <w:t xml:space="preserve">Default: </w:t>
+      </w:r>
+      <w:r>
+        <w:t>??</w:t>
+      </w:r>
+      <w:r>
+        <w:t xml:space="preserve"> </w:t>
+      </w:r>
+    </w:p>
+    <w:p>
+      <w:pPr>
+        <w:pStyle w:val="ListParagraph"/>
+        <w:numPr>
+          <w:ilvl w:val="1"/>
+          <w:numId w:val="3"/>
+        </w:numPr>
+      </w:pPr>
+      <w:r>
+        <w:t>manuelle Änderung</w:t>
+      </w:r>
+    </w:p>
+    <w:p>
+      <w:pPr>
+        <w:pStyle w:val="ListParagraph"/>
+        <w:numPr>
+          <w:ilvl w:val="0"/>
+          <w:numId w:val="3"/>
+        </w:numPr>
+      </w:pPr>
+      <w:r>
+        <w:t>Deaktivierungsgrenzwert definieren</w:t>
+      </w:r>
+    </w:p>
+    <w:p>
+      <w:pPr>
+        <w:pStyle w:val="ListParagraph"/>
+        <w:numPr>
+          <w:ilvl w:val="1"/>
+          <w:numId w:val="3"/>
+        </w:numPr>
+      </w:pPr>
+      <w:r>
+        <w:t>Default ??</w:t>
+      </w:r>
+    </w:p>
+    <w:p>
+      <w:pPr>
+        <w:pStyle w:val="ListParagraph"/>
+        <w:numPr>
+          <w:ilvl w:val="1"/>
+          <w:numId w:val="3"/>
+        </w:numPr>
+      </w:pPr>
+      <w:r>
+        <w:t>manuelle Änderung</w:t>
+      </w:r>
+      <w:r>
+        <w:t xml:space="preserve"> </w:t>
       </w:r>
     </w:p>
     <w:p>
@@ -72,6 +251,42 @@
     <w:p>
       <w:r>
         <w:t>Datenquelle: Vorprojekt</w:t>
+      </w:r>
+    </w:p>
+    <w:p>
+      <w:pPr>
+        <w:pStyle w:val="ListParagraph"/>
+        <w:numPr>
+          <w:ilvl w:val="0"/>
+          <w:numId w:val="4"/>
+        </w:numPr>
+      </w:pPr>
+      <w:r>
+        <w:t>statische/dynamische Verteilung</w:t>
+      </w:r>
+    </w:p>
+    <w:p>
+      <w:pPr>
+        <w:pStyle w:val="ListParagraph"/>
+        <w:numPr>
+          <w:ilvl w:val="0"/>
+          <w:numId w:val="4"/>
+        </w:numPr>
+      </w:pPr>
+      <w:r>
+        <w:t>Überschuss/alles liefern</w:t>
+      </w:r>
+    </w:p>
+    <w:p>
+      <w:pPr>
+        <w:pStyle w:val="ListParagraph"/>
+        <w:numPr>
+          <w:ilvl w:val="1"/>
+          <w:numId w:val="4"/>
+        </w:numPr>
+      </w:pPr>
+      <w:r>
+        <w:t>alles geht eigentlich nicht (Ablesung direkt am Smart Meter)</w:t>
       </w:r>
     </w:p>
     <w:p>
@@ -170,95 +385,31 @@
         <w:pStyle w:val="Heading3"/>
       </w:pPr>
       <w:r>
-        <w:t>Sonneneinstrahlung</w:t>
-      </w:r>
-    </w:p>
-    <w:p/>
-    <w:p>
-      <w:pPr>
-        <w:pStyle w:val="Heading3"/>
-      </w:pPr>
-      <w:r>
-        <w:t>Außentemperatur</w:t>
-      </w:r>
-    </w:p>
-    <w:p/>
-    <w:p>
-      <w:pPr>
-        <w:pStyle w:val="Heading3"/>
-      </w:pPr>
-      <w:r>
         <w:t>Vorhersage</w:t>
       </w:r>
     </w:p>
-    <w:p/>
-    <w:p>
-      <w:pPr>
-        <w:pStyle w:val="Heading2"/>
-      </w:pPr>
-      <w:r>
-        <w:t>Ist/Soll Temperatur</w:t>
-      </w:r>
-    </w:p>
-    <w:p>
-      <w:r>
-        <w:t>Datenquelle: Temperatursensor</w:t>
-      </w:r>
-    </w:p>
-    <w:p>
-      <w:pPr>
-        <w:pStyle w:val="Heading3"/>
-      </w:pPr>
-      <w:r>
-        <w:t>Räume</w:t>
-      </w:r>
-    </w:p>
-    <w:p/>
-    <w:p>
-      <w:pPr>
-        <w:pStyle w:val="Heading3"/>
-      </w:pPr>
-      <w:r>
-        <w:t>Warmwasser</w:t>
-      </w:r>
-    </w:p>
-    <w:p/>
-    <w:p>
-      <w:pPr>
-        <w:pStyle w:val="Heading2"/>
-      </w:pPr>
-      <w:r>
-        <w:t>Weitere</w:t>
-      </w:r>
-      <w:r>
-        <w:t xml:space="preserve"> Einflüsse</w:t>
-      </w:r>
-    </w:p>
-    <w:p>
-      <w:pPr>
-        <w:pStyle w:val="Heading3"/>
-      </w:pPr>
-      <w:r>
-        <w:t>Batteriespeicher</w:t>
-      </w:r>
-    </w:p>
-    <w:p>
-      <w:r>
-        <w:t>Datenquelle: ??</w:t>
-      </w:r>
-    </w:p>
-    <w:p>
-      <w:pPr>
-        <w:pStyle w:val="Heading3"/>
-      </w:pPr>
-      <w:r>
-        <w:lastRenderedPageBreak/>
-        <w:t>Pufferspeicher</w:t>
-      </w:r>
-    </w:p>
-    <w:p>
-      <w:r>
-        <w:t>Datenquelle: ??</w:t>
+    <w:p>
+      <w:pPr>
+        <w:pStyle w:val="ListParagraph"/>
+        <w:numPr>
+          <w:ilvl w:val="0"/>
+          <w:numId w:val="1"/>
+        </w:numPr>
+      </w:pPr>
+      <w:r>
+        <w:t>Wolken</w:t>
+      </w:r>
+    </w:p>
+    <w:p>
+      <w:pPr>
+        <w:pStyle w:val="ListParagraph"/>
+        <w:numPr>
+          <w:ilvl w:val="0"/>
+          <w:numId w:val="1"/>
+        </w:numPr>
+      </w:pPr>
+      <w:r>
+        <w:t>Nebel</w:t>
       </w:r>
     </w:p>
     <w:sectPr>
@@ -274,6 +425,232 @@
 <file path=word/numbering.xml><?xml version="1.0" encoding="utf-8"?>
 <w:numbering xmlns:wpc="http://schemas.microsoft.com/office/word/2010/wordprocessingCanvas" xmlns:cx="http://schemas.microsoft.com/office/drawing/2014/chartex" xmlns:cx1="http://schemas.microsoft.com/office/drawing/2015/9/8/chartex" xmlns:cx2="http://schemas.microsoft.com/office/drawing/2015/10/21/chartex" xmlns:cx3="http://schemas.microsoft.com/office/drawing/2016/5/9/chartex" xmlns:cx4="http://schemas.microsoft.com/office/drawing/2016/5/10/chartex" xmlns:cx5="http://schemas.microsoft.com/office/drawing/2016/5/11/chartex" xmlns:cx6="http://schemas.microsoft.com/office/drawing/2016/5/12/chartex" xmlns:cx7="http://schemas.microsoft.com/office/drawing/2016/5/13/chartex" xmlns:cx8="http://schemas.microsoft.com/office/drawing/2016/5/14/chartex" xmlns:mc="http://schemas.openxmlformats.org/markup-compatibility/2006" xmlns:aink="http://schemas.microsoft.com/office/drawing/2016/ink" xmlns:am3d="http://schemas.microsoft.com/office/drawing/2017/model3d" xmlns:o="urn:schemas-microsoft-com:office:office" xmlns:oel="http://schemas.microsoft.com/office/2019/extlst" xmlns:r="http://schemas.openxmlformats.org/officeDocument/2006/relationships" xmlns:m="http://schemas.openxmlformats.org/officeDocument/2006/math" xmlns:v="urn:schemas-microsoft-com:vml" xmlns:wp14="http://schemas.microsoft.com/office/word/2010/wordprocessingDrawing" xmlns:wp="http://schemas.openxmlformats.org/drawingml/2006/wordprocessingDrawing" xmlns:w10="urn:schemas-microsoft-com:office:word" xmlns:w="http://schemas.openxmlformats.org/wordprocessingml/2006/main" xmlns:w14="http://schemas.microsoft.com/office/word/2010/wordml" xmlns:w15="http://schemas.microsoft.com/office/word/2012/wordml" xmlns:w16cex="http://schemas.microsoft.com/office/word/2018/wordml/cex" xmlns:w16cid="http://schemas.microsoft.com/office/word/2016/wordml/cid" xmlns:w16="http://schemas.microsoft.com/office/word/2018/wordml" xmlns:w16sdtdh="http://schemas.microsoft.com/office/word/2020/wordml/sdtdatahash" xmlns:w16se="http://schemas.microsoft.com/office/word/2015/wordml/symex" xmlns:wpg="http://schemas.microsoft.com/office/word/2010/wordprocessingGroup" xmlns:wpi="http://schemas.microsoft.com/office/word/2010/wordprocessingInk" xmlns:wne="http://schemas.microsoft.com/office/word/2006/wordml" xmlns:wps="http://schemas.microsoft.com/office/word/2010/wordprocessingShape" mc:Ignorable="w14 w15 w16se w16cid w16 w16cex w16sdtdh wp14">
   <w:abstractNum w:abstractNumId="0" w15:restartNumberingAfterBreak="0">
+    <w:nsid w:val="0E8F3785"/>
+    <w:multiLevelType w:val="hybridMultilevel"/>
+    <w:tmpl w:val="6F8A9568"/>
+    <w:lvl w:ilvl="0" w:tplc="0C070001">
+      <w:start w:val="1"/>
+      <w:numFmt w:val="bullet"/>
+      <w:lvlText w:val=""/>
+      <w:lvlJc w:val="left"/>
+      <w:pPr>
+        <w:ind w:left="720" w:hanging="360"/>
+      </w:pPr>
+      <w:rPr>
+        <w:rFonts w:ascii="Symbol" w:hAnsi="Symbol" w:hint="default"/>
+      </w:rPr>
+    </w:lvl>
+    <w:lvl w:ilvl="1" w:tplc="0C070003">
+      <w:start w:val="1"/>
+      <w:numFmt w:val="bullet"/>
+      <w:lvlText w:val="o"/>
+      <w:lvlJc w:val="left"/>
+      <w:pPr>
+        <w:ind w:left="1440" w:hanging="360"/>
+      </w:pPr>
+      <w:rPr>
+        <w:rFonts w:ascii="Courier New" w:hAnsi="Courier New" w:cs="Courier New" w:hint="default"/>
+      </w:rPr>
+    </w:lvl>
+    <w:lvl w:ilvl="2" w:tplc="0C070005" w:tentative="1">
+      <w:start w:val="1"/>
+      <w:numFmt w:val="bullet"/>
+      <w:lvlText w:val=""/>
+      <w:lvlJc w:val="left"/>
+      <w:pPr>
+        <w:ind w:left="2160" w:hanging="360"/>
+      </w:pPr>
+      <w:rPr>
+        <w:rFonts w:ascii="Wingdings" w:hAnsi="Wingdings" w:hint="default"/>
+      </w:rPr>
+    </w:lvl>
+    <w:lvl w:ilvl="3" w:tplc="0C070001" w:tentative="1">
+      <w:start w:val="1"/>
+      <w:numFmt w:val="bullet"/>
+      <w:lvlText w:val=""/>
+      <w:lvlJc w:val="left"/>
+      <w:pPr>
+        <w:ind w:left="2880" w:hanging="360"/>
+      </w:pPr>
+      <w:rPr>
+        <w:rFonts w:ascii="Symbol" w:hAnsi="Symbol" w:hint="default"/>
+      </w:rPr>
+    </w:lvl>
+    <w:lvl w:ilvl="4" w:tplc="0C070003" w:tentative="1">
+      <w:start w:val="1"/>
+      <w:numFmt w:val="bullet"/>
+      <w:lvlText w:val="o"/>
+      <w:lvlJc w:val="left"/>
+      <w:pPr>
+        <w:ind w:left="3600" w:hanging="360"/>
+      </w:pPr>
+      <w:rPr>
+        <w:rFonts w:ascii="Courier New" w:hAnsi="Courier New" w:cs="Courier New" w:hint="default"/>
+      </w:rPr>
+    </w:lvl>
+    <w:lvl w:ilvl="5" w:tplc="0C070005" w:tentative="1">
+      <w:start w:val="1"/>
+      <w:numFmt w:val="bullet"/>
+      <w:lvlText w:val=""/>
+      <w:lvlJc w:val="left"/>
+      <w:pPr>
+        <w:ind w:left="4320" w:hanging="360"/>
+      </w:pPr>
+      <w:rPr>
+        <w:rFonts w:ascii="Wingdings" w:hAnsi="Wingdings" w:hint="default"/>
+      </w:rPr>
+    </w:lvl>
+    <w:lvl w:ilvl="6" w:tplc="0C070001" w:tentative="1">
+      <w:start w:val="1"/>
+      <w:numFmt w:val="bullet"/>
+      <w:lvlText w:val=""/>
+      <w:lvlJc w:val="left"/>
+      <w:pPr>
+        <w:ind w:left="5040" w:hanging="360"/>
+      </w:pPr>
+      <w:rPr>
+        <w:rFonts w:ascii="Symbol" w:hAnsi="Symbol" w:hint="default"/>
+      </w:rPr>
+    </w:lvl>
+    <w:lvl w:ilvl="7" w:tplc="0C070003" w:tentative="1">
+      <w:start w:val="1"/>
+      <w:numFmt w:val="bullet"/>
+      <w:lvlText w:val="o"/>
+      <w:lvlJc w:val="left"/>
+      <w:pPr>
+        <w:ind w:left="5760" w:hanging="360"/>
+      </w:pPr>
+      <w:rPr>
+        <w:rFonts w:ascii="Courier New" w:hAnsi="Courier New" w:cs="Courier New" w:hint="default"/>
+      </w:rPr>
+    </w:lvl>
+    <w:lvl w:ilvl="8" w:tplc="0C070005" w:tentative="1">
+      <w:start w:val="1"/>
+      <w:numFmt w:val="bullet"/>
+      <w:lvlText w:val=""/>
+      <w:lvlJc w:val="left"/>
+      <w:pPr>
+        <w:ind w:left="6480" w:hanging="360"/>
+      </w:pPr>
+      <w:rPr>
+        <w:rFonts w:ascii="Wingdings" w:hAnsi="Wingdings" w:hint="default"/>
+      </w:rPr>
+    </w:lvl>
+  </w:abstractNum>
+  <w:abstractNum w:abstractNumId="1" w15:restartNumberingAfterBreak="0">
+    <w:nsid w:val="303C3478"/>
+    <w:multiLevelType w:val="hybridMultilevel"/>
+    <w:tmpl w:val="55087B70"/>
+    <w:lvl w:ilvl="0" w:tplc="0C070001">
+      <w:start w:val="1"/>
+      <w:numFmt w:val="bullet"/>
+      <w:lvlText w:val=""/>
+      <w:lvlJc w:val="left"/>
+      <w:pPr>
+        <w:ind w:left="720" w:hanging="360"/>
+      </w:pPr>
+      <w:rPr>
+        <w:rFonts w:ascii="Symbol" w:hAnsi="Symbol" w:hint="default"/>
+      </w:rPr>
+    </w:lvl>
+    <w:lvl w:ilvl="1" w:tplc="0C070003">
+      <w:start w:val="1"/>
+      <w:numFmt w:val="bullet"/>
+      <w:lvlText w:val="o"/>
+      <w:lvlJc w:val="left"/>
+      <w:pPr>
+        <w:ind w:left="1440" w:hanging="360"/>
+      </w:pPr>
+      <w:rPr>
+        <w:rFonts w:ascii="Courier New" w:hAnsi="Courier New" w:cs="Courier New" w:hint="default"/>
+      </w:rPr>
+    </w:lvl>
+    <w:lvl w:ilvl="2" w:tplc="0C070005" w:tentative="1">
+      <w:start w:val="1"/>
+      <w:numFmt w:val="bullet"/>
+      <w:lvlText w:val=""/>
+      <w:lvlJc w:val="left"/>
+      <w:pPr>
+        <w:ind w:left="2160" w:hanging="360"/>
+      </w:pPr>
+      <w:rPr>
+        <w:rFonts w:ascii="Wingdings" w:hAnsi="Wingdings" w:hint="default"/>
+      </w:rPr>
+    </w:lvl>
+    <w:lvl w:ilvl="3" w:tplc="0C070001" w:tentative="1">
+      <w:start w:val="1"/>
+      <w:numFmt w:val="bullet"/>
+      <w:lvlText w:val=""/>
+      <w:lvlJc w:val="left"/>
+      <w:pPr>
+        <w:ind w:left="2880" w:hanging="360"/>
+      </w:pPr>
+      <w:rPr>
+        <w:rFonts w:ascii="Symbol" w:hAnsi="Symbol" w:hint="default"/>
+      </w:rPr>
+    </w:lvl>
+    <w:lvl w:ilvl="4" w:tplc="0C070003" w:tentative="1">
+      <w:start w:val="1"/>
+      <w:numFmt w:val="bullet"/>
+      <w:lvlText w:val="o"/>
+      <w:lvlJc w:val="left"/>
+      <w:pPr>
+        <w:ind w:left="3600" w:hanging="360"/>
+      </w:pPr>
+      <w:rPr>
+        <w:rFonts w:ascii="Courier New" w:hAnsi="Courier New" w:cs="Courier New" w:hint="default"/>
+      </w:rPr>
+    </w:lvl>
+    <w:lvl w:ilvl="5" w:tplc="0C070005" w:tentative="1">
+      <w:start w:val="1"/>
+      <w:numFmt w:val="bullet"/>
+      <w:lvlText w:val=""/>
+      <w:lvlJc w:val="left"/>
+      <w:pPr>
+        <w:ind w:left="4320" w:hanging="360"/>
+      </w:pPr>
+      <w:rPr>
+        <w:rFonts w:ascii="Wingdings" w:hAnsi="Wingdings" w:hint="default"/>
+      </w:rPr>
+    </w:lvl>
+    <w:lvl w:ilvl="6" w:tplc="0C070001" w:tentative="1">
+      <w:start w:val="1"/>
+      <w:numFmt w:val="bullet"/>
+      <w:lvlText w:val=""/>
+      <w:lvlJc w:val="left"/>
+      <w:pPr>
+        <w:ind w:left="5040" w:hanging="360"/>
+      </w:pPr>
+      <w:rPr>
+        <w:rFonts w:ascii="Symbol" w:hAnsi="Symbol" w:hint="default"/>
+      </w:rPr>
+    </w:lvl>
+    <w:lvl w:ilvl="7" w:tplc="0C070003" w:tentative="1">
+      <w:start w:val="1"/>
+      <w:numFmt w:val="bullet"/>
+      <w:lvlText w:val="o"/>
+      <w:lvlJc w:val="left"/>
+      <w:pPr>
+        <w:ind w:left="5760" w:hanging="360"/>
+      </w:pPr>
+      <w:rPr>
+        <w:rFonts w:ascii="Courier New" w:hAnsi="Courier New" w:cs="Courier New" w:hint="default"/>
+      </w:rPr>
+    </w:lvl>
+    <w:lvl w:ilvl="8" w:tplc="0C070005" w:tentative="1">
+      <w:start w:val="1"/>
+      <w:numFmt w:val="bullet"/>
+      <w:lvlText w:val=""/>
+      <w:lvlJc w:val="left"/>
+      <w:pPr>
+        <w:ind w:left="6480" w:hanging="360"/>
+      </w:pPr>
+      <w:rPr>
+        <w:rFonts w:ascii="Wingdings" w:hAnsi="Wingdings" w:hint="default"/>
+      </w:rPr>
+    </w:lvl>
+  </w:abstractNum>
+  <w:abstractNum w:abstractNumId="2" w15:restartNumberingAfterBreak="0">
     <w:nsid w:val="31AF4F06"/>
     <w:multiLevelType w:val="hybridMultilevel"/>
     <w:tmpl w:val="D4BA72A4"/>
@@ -289,7 +666,7 @@
         <w:rFonts w:ascii="Symbol" w:hAnsi="Symbol" w:hint="default"/>
       </w:rPr>
     </w:lvl>
-    <w:lvl w:ilvl="1" w:tplc="0C070003" w:tentative="1">
+    <w:lvl w:ilvl="1" w:tplc="0C070003">
       <w:start w:val="1"/>
       <w:numFmt w:val="bullet"/>
       <w:lvlText w:val="o"/>
@@ -386,10 +763,10 @@
       </w:rPr>
     </w:lvl>
   </w:abstractNum>
-  <w:abstractNum w:abstractNumId="1" w15:restartNumberingAfterBreak="0">
+  <w:abstractNum w:abstractNumId="3" w15:restartNumberingAfterBreak="0">
     <w:nsid w:val="7C4822EE"/>
     <w:multiLevelType w:val="hybridMultilevel"/>
-    <w:tmpl w:val="64C41502"/>
+    <w:tmpl w:val="CB6227CC"/>
     <w:lvl w:ilvl="0" w:tplc="0C070001">
       <w:start w:val="1"/>
       <w:numFmt w:val="bullet"/>
@@ -500,9 +877,15 @@
     </w:lvl>
   </w:abstractNum>
   <w:num w:numId="1" w16cid:durableId="1962178457">
+    <w:abstractNumId w:val="3"/>
+  </w:num>
+  <w:num w:numId="2" w16cid:durableId="478769374">
+    <w:abstractNumId w:val="2"/>
+  </w:num>
+  <w:num w:numId="3" w16cid:durableId="238639894">
     <w:abstractNumId w:val="1"/>
   </w:num>
-  <w:num w:numId="2" w16cid:durableId="478769374">
+  <w:num w:numId="4" w16cid:durableId="1487747068">
     <w:abstractNumId w:val="0"/>
   </w:num>
 </w:numbering>
@@ -975,7 +1358,6 @@
   <w:style w:type="character" w:default="1" w:styleId="DefaultParagraphFont">
     <w:name w:val="Default Paragraph Font"/>
     <w:uiPriority w:val="1"/>
-    <w:semiHidden/>
     <w:unhideWhenUsed/>
   </w:style>
   <w:style w:type="table" w:default="1" w:styleId="TableNormal">

</xml_diff>